<commit_message>
Décalage axe x en affichage mensuel, hovers, layout avec scrollbar, heatmap-var
</commit_message>
<xml_diff>
--- a/about/Description.docx
+++ b/about/Description.docx
@@ -14,22 +14,224 @@
           <w:b/>
           <w:bCs/>
         </w:rPr>
+        <w:t>Version courte :</w:t>
+      </w:r>
+    </w:p>
+    <w:p>
+      <w:pPr>
+        <w:rPr>
+          <w:b/>
+          <w:bCs/>
+        </w:rPr>
+      </w:pPr>
+    </w:p>
+    <w:p>
+      <w:pPr>
+        <w:rPr>
+          <w:b/>
+          <w:bCs/>
+          <w:sz w:val="36"/>
+          <w:szCs w:val="36"/>
+        </w:rPr>
+      </w:pPr>
+      <w:proofErr w:type="spellStart"/>
+      <w:r>
+        <w:rPr>
+          <w:b/>
+          <w:bCs/>
+          <w:sz w:val="36"/>
+          <w:szCs w:val="36"/>
+        </w:rPr>
+        <w:t>ClimateCheck</w:t>
+      </w:r>
+      <w:proofErr w:type="spellEnd"/>
+    </w:p>
+    <w:p>
+      <w:pPr>
+        <w:rPr>
+          <w:b/>
+          <w:bCs/>
+        </w:rPr>
+      </w:pPr>
+      <w:r>
+        <w:rPr>
+          <w:b/>
+          <w:bCs/>
+        </w:rPr>
         <w:t>Cet outil permet de visualiser et comparer différents jeux de données climatiques utilisés pour la simulation thermique des bâtiments.</w:t>
       </w:r>
     </w:p>
     <w:p>
-      <w:pPr>
-        <w:rPr>
-          <w:b/>
-          <w:bCs/>
-        </w:rPr>
-      </w:pPr>
-      <w:r>
-        <w:rPr>
-          <w:b/>
-          <w:bCs/>
-        </w:rPr>
-        <w:t>Introduction</w:t>
+      <w:r>
+        <w:t>Les simulations thermiques dynamiques sont de plus en plus utilisées pour analyser les risques de surchauffe des bâtiments, estimer leur consommation d’énergie</w:t>
+      </w:r>
+      <w:r>
+        <w:t xml:space="preserve"> et dimensionner les installations</w:t>
+      </w:r>
+      <w:r>
+        <w:t>. Le climat joue un rôle prépondérant dans de telles analyses, et il est important de choisir un scenario qui corresponde au mieux à la réalité – également celle de demain.</w:t>
+      </w:r>
+    </w:p>
+    <w:p>
+      <w:r>
+        <w:t>La SIA met à disposition des données météo détaillées pour une cinquantaine de stations en Suisse. Pour chaque station, plusieurs scenarios sont disponibles, correspondant à différents horizons de temps et niveaux d’émissions de gaz à effet de serre. Il existe aussi des scenarios correspondant aux étés chauds survenant environ une année sur dix.</w:t>
+      </w:r>
+    </w:p>
+    <w:p>
+      <w:pPr>
+        <w:rPr>
+          <w:b/>
+          <w:bCs/>
+        </w:rPr>
+      </w:pPr>
+      <w:r>
+        <w:rPr>
+          <w:b/>
+          <w:bCs/>
+        </w:rPr>
+        <w:t>Les nouvelles données de la SIA 4028</w:t>
+      </w:r>
+    </w:p>
+    <w:p>
+      <w:r>
+        <w:t>La nouvelle norme SIA 4028 apportera prochainement une mise à jour de ces données. Quel sera l’impact sur les projets de construction et de rénovation ? Et comment se distinguent les exigences renforcées de certains labels, par rapport aux normes légales ?</w:t>
+      </w:r>
+      <w:r>
+        <w:t xml:space="preserve"> Les nouvelles données ont été dévoilées lors d’une consultation publique. Elles pourraient encore être retouchées avant publication – mais leur visualisation donne déjà un aperçu des changements.</w:t>
+      </w:r>
+    </w:p>
+    <w:p>
+      <w:pPr>
+        <w:rPr>
+          <w:b/>
+          <w:bCs/>
+        </w:rPr>
+      </w:pPr>
+      <w:r>
+        <w:rPr>
+          <w:b/>
+          <w:bCs/>
+        </w:rPr>
+        <w:t>Un outil pour mieux choisir</w:t>
+      </w:r>
+    </w:p>
+    <w:p>
+      <w:r>
+        <w:t>Concrètement, il peut s’avérer difficile de choisir le bon fichier météo parmi les nombreux scenarios disponibles.</w:t>
+      </w:r>
+    </w:p>
+    <w:p>
+      <w:r>
+        <w:t xml:space="preserve">L’outil ci-dessous permet de comparer toutes les données de la SIA en les visualisant sous forme de graphe, de </w:t>
+      </w:r>
+      <w:proofErr w:type="spellStart"/>
+      <w:r>
+        <w:t>heatmap</w:t>
+      </w:r>
+      <w:proofErr w:type="spellEnd"/>
+      <w:r>
+        <w:t xml:space="preserve"> ou </w:t>
+      </w:r>
+      <w:r>
+        <w:t xml:space="preserve">de </w:t>
+      </w:r>
+      <w:r>
+        <w:t>rose des vents.</w:t>
+      </w:r>
+    </w:p>
+    <w:p>
+      <w:r>
+        <w:t xml:space="preserve">Il s’adresse aux </w:t>
+      </w:r>
+      <w:proofErr w:type="spellStart"/>
+      <w:r>
+        <w:t>ingénieur·es</w:t>
+      </w:r>
+      <w:proofErr w:type="spellEnd"/>
+      <w:r>
+        <w:t xml:space="preserve"> en thermique du bâtiment et doit leur permette un choix avisé pour leurs modélisations. </w:t>
+      </w:r>
+      <w:r>
+        <w:rPr>
+          <w:b/>
+          <w:bCs/>
+        </w:rPr>
+        <w:br w:type="page"/>
+      </w:r>
+    </w:p>
+    <w:p>
+      <w:pPr>
+        <w:rPr>
+          <w:b/>
+          <w:bCs/>
+        </w:rPr>
+      </w:pPr>
+      <w:r>
+        <w:rPr>
+          <w:b/>
+          <w:bCs/>
+        </w:rPr>
+        <w:lastRenderedPageBreak/>
+        <w:t>Version longue :</w:t>
+      </w:r>
+    </w:p>
+    <w:p>
+      <w:pPr>
+        <w:rPr>
+          <w:b/>
+          <w:bCs/>
+        </w:rPr>
+      </w:pPr>
+    </w:p>
+    <w:p>
+      <w:pPr>
+        <w:rPr>
+          <w:b/>
+          <w:bCs/>
+          <w:sz w:val="36"/>
+          <w:szCs w:val="36"/>
+        </w:rPr>
+      </w:pPr>
+      <w:proofErr w:type="spellStart"/>
+      <w:r>
+        <w:rPr>
+          <w:b/>
+          <w:bCs/>
+          <w:sz w:val="36"/>
+          <w:szCs w:val="36"/>
+        </w:rPr>
+        <w:t>ClimateCheck</w:t>
+      </w:r>
+      <w:proofErr w:type="spellEnd"/>
+    </w:p>
+    <w:p>
+      <w:pPr>
+        <w:rPr>
+          <w:b/>
+          <w:bCs/>
+        </w:rPr>
+      </w:pPr>
+      <w:r>
+        <w:rPr>
+          <w:b/>
+          <w:bCs/>
+        </w:rPr>
+        <w:t>Cet outil permet de visualiser et comparer différents jeux de données climatiques utilisés pour la simulation thermique des bâtiments.</w:t>
+      </w:r>
+    </w:p>
+    <w:p>
+      <w:pPr>
+        <w:rPr>
+          <w:b/>
+          <w:bCs/>
+        </w:rPr>
+      </w:pPr>
+      <w:r>
+        <w:rPr>
+          <w:b/>
+          <w:bCs/>
+        </w:rPr>
+        <w:t>Contexte</w:t>
       </w:r>
     </w:p>
     <w:p>
@@ -51,19 +253,13 @@
         <w:t xml:space="preserve">lors </w:t>
       </w:r>
       <w:r>
-        <w:t xml:space="preserve">d’une rénovation, les ingénieurs doivent démontrer que les mesures choisies suffisent à </w:t>
-      </w:r>
-      <w:r>
-        <w:t>éviter</w:t>
-      </w:r>
-      <w:r>
-        <w:t xml:space="preserve"> l</w:t>
-      </w:r>
-      <w:r>
-        <w:t>es problèmes de</w:t>
-      </w:r>
-      <w:r>
-        <w:t xml:space="preserve"> surchauffe. </w:t>
+        <w:t xml:space="preserve">d’une rénovation, les ingénieurs doivent démontrer que les mesures choisies </w:t>
+      </w:r>
+      <w:r>
+        <w:t>permettent d’assurer le confort thermique</w:t>
+      </w:r>
+      <w:r>
+        <w:t xml:space="preserve">. </w:t>
       </w:r>
       <w:r>
         <w:t>Le cas échéant, ils doivent aussi estimer la quantité d’énergie nécessaire pour refroidir le bâtiment, afin de dimensionner correctement les installations.</w:t>
@@ -95,13 +291,13 @@
         <w:t xml:space="preserve"> </w:t>
       </w:r>
       <w:r>
-        <w:t>celles-ci ne s’appliquent que pour des cas simples : villas et immeubles de logements très standards. Et encore : au vu du changement climatique, les règles issues de la pratique risque</w:t>
-      </w:r>
-      <w:r>
-        <w:t>nt</w:t>
-      </w:r>
-      <w:r>
-        <w:t xml:space="preserve"> de montrer certaines limites pour le climat de demain. </w:t>
+        <w:t xml:space="preserve">celles-ci ne s’appliquent que pour des cas simples : villas et immeubles de logements très standards. Et encore : au vu du changement climatique, les règles issues de la pratique </w:t>
+      </w:r>
+      <w:r>
+        <w:t xml:space="preserve">vont </w:t>
+      </w:r>
+      <w:r>
+        <w:t xml:space="preserve">montrer certaines limites pour le climat de demain. </w:t>
       </w:r>
     </w:p>
     <w:p>
@@ -133,36 +329,55 @@
         <w:t xml:space="preserve">, </w:t>
       </w:r>
       <w:r>
-        <w:t xml:space="preserve">c’est-à-dire une modélisation </w:t>
-      </w:r>
-      <w:r>
-        <w:t>basée sur le climat et sur de multiples paramètres propres au bâtiment et à son occupation.</w:t>
-      </w:r>
-    </w:p>
-    <w:p>
-      <w:pPr>
-        <w:rPr>
-          <w:b/>
-          <w:bCs/>
-        </w:rPr>
-      </w:pPr>
-      <w:r>
-        <w:rPr>
-          <w:b/>
-          <w:bCs/>
-        </w:rPr>
-        <w:t>L’importance des données climatiques</w:t>
-      </w:r>
-    </w:p>
-    <w:p>
-      <w:r>
-        <w:t>Le climat joue un rôle prépondérant dans une telle analyse, et il est donc important de choisir un scenario qui corresponde au mieux à la réalité. D’une part, il s’agit d’avoir des données pertinentes pour la zone géographique du bâtiment étudié. En Suisse, à cause d’une topographie complexe, les conditions peuvent fortement différer sur une distance de quelques kilomètres. Nous disposons par chance d’un réseau de stations météo</w:t>
-      </w:r>
-      <w:r>
-        <w:t xml:space="preserve"> </w:t>
-      </w:r>
-      <w:r>
-        <w:t>très dense</w:t>
+        <w:t>c’est-à-dire une m</w:t>
+      </w:r>
+      <w:r>
+        <w:t xml:space="preserve">odélisation </w:t>
+      </w:r>
+      <w:r>
+        <w:t>basée sur l</w:t>
+      </w:r>
+      <w:r>
+        <w:t xml:space="preserve">a météo </w:t>
+      </w:r>
+      <w:r>
+        <w:t>et sur de multiples paramètres propres au bâtiment et à son occupation.</w:t>
+      </w:r>
+    </w:p>
+    <w:p>
+      <w:pPr>
+        <w:rPr>
+          <w:b/>
+          <w:bCs/>
+        </w:rPr>
+      </w:pPr>
+      <w:r>
+        <w:rPr>
+          <w:b/>
+          <w:bCs/>
+        </w:rPr>
+        <w:t>L’importance de</w:t>
+      </w:r>
+      <w:r>
+        <w:rPr>
+          <w:b/>
+          <w:bCs/>
+        </w:rPr>
+        <w:t xml:space="preserve"> la météo</w:t>
+      </w:r>
+    </w:p>
+    <w:p>
+      <w:r>
+        <w:t>Une telle simulation modélise le comportement du bâtiment heure par heure sur une année entière. Les données d’entrée – et notamment la météo – doivent donc être fournie au pas de temps horaire pour l’année entière. I</w:t>
+      </w:r>
+      <w:r>
+        <w:t xml:space="preserve">l est important de choisir un </w:t>
+      </w:r>
+      <w:r>
+        <w:t>jeu de donnée météo</w:t>
+      </w:r>
+      <w:r>
+        <w:t xml:space="preserve"> qui corresponde au mieux à la réalité</w:t>
       </w:r>
       <w:r>
         <w:t>.</w:t>
@@ -170,10 +385,40 @@
     </w:p>
     <w:p>
       <w:r>
+        <w:t>D’une part, il s’agit d’avoir des données pertinentes pour la zone géographique du bâtiment étudié. En Suisse, à cause d’une topographie complexe, les conditions peuvent fortement différer sur une distance de quelques kilomètres. Nous disposons par chance d’un réseau de stations météo</w:t>
+      </w:r>
+      <w:r>
+        <w:t xml:space="preserve"> très dense</w:t>
+      </w:r>
+      <w:r>
+        <w:t>.</w:t>
+      </w:r>
+    </w:p>
+    <w:p>
+      <w:pPr>
+        <w:rPr>
+          <w:b/>
+          <w:bCs/>
+        </w:rPr>
+      </w:pPr>
+      <w:r>
+        <w:rPr>
+          <w:b/>
+          <w:bCs/>
+        </w:rPr>
+        <w:t>De la météo au climat</w:t>
+      </w:r>
+    </w:p>
+    <w:p>
+      <w:r>
         <w:t>D’autre part,</w:t>
       </w:r>
       <w:r>
-        <w:t xml:space="preserve"> à cause du changement climatique, les données issues d’observations sur les trente dernières années ne sont plus représentatives du climat actuel, et encore moins du climat futur – sachant qu’un bâtiment est conçu pour durer au moins 60 ans, et bien plus si possible.</w:t>
+        <w:t xml:space="preserve"> à cause du changement climatique, les données issues d’observations sur les trente dernières années ne sont plus représentatives du climat actuel, et encore </w:t>
+      </w:r>
+      <w:r>
+        <w:lastRenderedPageBreak/>
+        <w:t>moins du climat futur – sachant qu’un bâtiment est conçu pour durer au moins 60 ans, et bien plus si possible.</w:t>
       </w:r>
     </w:p>
     <w:p>
@@ -189,10 +434,53 @@
         <w:t xml:space="preserve"> a établi des scenarios pour le climat futur</w:t>
       </w:r>
       <w:r>
-        <w:t xml:space="preserve">. Ainsi en 2023 ont été publiés </w:t>
-      </w:r>
-      <w:r>
-        <w:t xml:space="preserve">des jeux de données représentatifs de 2035 et 2060. Mais le changement climatique est difficile à prévoir, et ces dernières années ont déjà remis en question </w:t>
+        <w:t xml:space="preserve">. </w:t>
+      </w:r>
+      <w:r>
+        <w:t xml:space="preserve">A partir des scenarios </w:t>
+      </w:r>
+      <w:r>
+        <w:rPr>
+          <w:i/>
+          <w:iCs/>
+        </w:rPr>
+        <w:t>climatiques</w:t>
+      </w:r>
+      <w:r>
+        <w:t xml:space="preserve">, </w:t>
+      </w:r>
+      <w:proofErr w:type="spellStart"/>
+      <w:r>
+        <w:t>MeteoSuisse</w:t>
+      </w:r>
+      <w:proofErr w:type="spellEnd"/>
+      <w:r>
+        <w:t xml:space="preserve"> a ensuite reconstruit des jeux de données </w:t>
+      </w:r>
+      <w:r>
+        <w:rPr>
+          <w:i/>
+          <w:iCs/>
+        </w:rPr>
+        <w:t>météorologiques</w:t>
+      </w:r>
+      <w:r>
+        <w:t xml:space="preserve">. </w:t>
+      </w:r>
+      <w:r>
+        <w:t xml:space="preserve">Ainsi en 2023 ont été publiés </w:t>
+      </w:r>
+      <w:r>
+        <w:t xml:space="preserve">des jeux de données représentatifs de 2035 et 2060. </w:t>
+      </w:r>
+      <w:r>
+        <w:t xml:space="preserve">Il existe aussi des scenarios correspondant aux étés chauds survenant environ une année sur dix. </w:t>
+      </w:r>
+      <w:r>
+        <w:t xml:space="preserve">Mais le changement climatique est difficile à prévoir, et ces dernières années ont déjà remis en question </w:t>
+      </w:r>
+      <w:r>
+        <w:t xml:space="preserve">toutes </w:t>
       </w:r>
       <w:r>
         <w:t>ces données figurant dans la SIA 2028 : 2023.</w:t>
@@ -215,7 +503,6 @@
     </w:p>
     <w:p>
       <w:r>
-        <w:lastRenderedPageBreak/>
         <w:t>C’est pourquoi la SIA prépare une nouvelle mouture, la SIA 4028, qui comporte un nouveau jeu de données représentatif de l’année 2023. Il a pour but de remplacer les jeux de données dits « contemporains » de la SIA 2028, qui étaient basés sur des observations de 1984 à 2003...</w:t>
       </w:r>
       <w:r>
@@ -265,7 +552,29 @@
     </w:p>
     <w:p>
       <w:r>
-        <w:t>L’outil ci-dessous permet de comparer ces data sets :</w:t>
+        <w:t xml:space="preserve">L’outil ci-dessous s’adresse aux </w:t>
+      </w:r>
+      <w:proofErr w:type="spellStart"/>
+      <w:r>
+        <w:t>ingénieur·es</w:t>
+      </w:r>
+      <w:proofErr w:type="spellEnd"/>
+      <w:r>
+        <w:t xml:space="preserve"> en thermique du bâtiment et doit leur permette un choix avisé pour leurs modélisations. </w:t>
+      </w:r>
+    </w:p>
+    <w:p>
+      <w:r>
+        <w:t>Il</w:t>
+      </w:r>
+      <w:r>
+        <w:t xml:space="preserve"> permet de comparer </w:t>
+      </w:r>
+      <w:r>
+        <w:t>l</w:t>
+      </w:r>
+      <w:r>
+        <w:t>es data sets :</w:t>
       </w:r>
     </w:p>
     <w:p>
@@ -277,7 +586,7 @@
         </w:numPr>
       </w:pPr>
       <w:r>
-        <w:t>Pour toutes les stations de suisse romande</w:t>
+        <w:t>Pour toutes les variables présentes dans les fichiers : température, rayonnement, vitesse du vent, précipitations, etc.</w:t>
       </w:r>
     </w:p>
     <w:p>
@@ -289,8 +598,21 @@
         </w:numPr>
       </w:pPr>
       <w:r>
-        <w:t>Pour toutes les variables présentes dans les fichiers : température, rayonnement, vitesse du vent, précipitations, etc.</w:t>
-      </w:r>
+        <w:t xml:space="preserve">Sous forme de graphe, de rose des vents ou de </w:t>
+      </w:r>
+      <w:proofErr w:type="spellStart"/>
+      <w:r>
+        <w:t>heat</w:t>
+      </w:r>
+      <w:proofErr w:type="spellEnd"/>
+      <w:r>
+        <w:t xml:space="preserve"> </w:t>
+      </w:r>
+      <w:proofErr w:type="spellStart"/>
+      <w:r>
+        <w:t>map</w:t>
+      </w:r>
+      <w:proofErr w:type="spellEnd"/>
     </w:p>
     <w:p>
       <w:pPr>
@@ -301,21 +623,8 @@
         </w:numPr>
       </w:pPr>
       <w:r>
-        <w:t xml:space="preserve">Sous forme de graphe, de rose des vents ou de </w:t>
-      </w:r>
-      <w:proofErr w:type="spellStart"/>
-      <w:r>
-        <w:t>heat</w:t>
-      </w:r>
-      <w:proofErr w:type="spellEnd"/>
-      <w:r>
-        <w:t xml:space="preserve"> </w:t>
-      </w:r>
-      <w:proofErr w:type="spellStart"/>
-      <w:r>
-        <w:t>map</w:t>
-      </w:r>
-      <w:proofErr w:type="spellEnd"/>
+        <w:t>Sous forme de données horaires ou de moyennes journalières, mensuelles, annuelles.</w:t>
+      </w:r>
     </w:p>
     <w:p>
       <w:pPr>
@@ -326,22 +635,10 @@
         </w:numPr>
       </w:pPr>
       <w:r>
-        <w:t>Sous forme de données horaires ou de moyennes journalières, mensuelles, annuelles.</w:t>
-      </w:r>
-    </w:p>
-    <w:p>
-      <w:pPr>
-        <w:pStyle w:val="Paragraphedeliste"/>
-        <w:numPr>
-          <w:ilvl w:val="0"/>
-          <w:numId w:val="2"/>
-        </w:numPr>
-      </w:pPr>
-      <w:r>
+        <w:lastRenderedPageBreak/>
         <w:t>Avec des enveloppes min/max, des courbes classées, des sommes cumulées, etc.</w:t>
       </w:r>
     </w:p>
-    <w:p/>
     <w:p>
       <w:r>
         <w:t>L</w:t>

</xml_diff>